<commit_message>
docs: align documentation with trading cockpit first
</commit_message>
<xml_diff>
--- a/docs/generated/docx/architecture/Infrastructure.docx
+++ b/docs/generated/docx/architecture/Infrastructure.docx
@@ -41,7 +41,7 @@
         <w:pStyle w:val="FirstParagraph"/>
       </w:pPr>
       <w:r>
-        <w:t xml:space="preserve">This document describes the Infrastructure layer of Trading Platform Pro.</w:t>
+        <w:t xml:space="preserve">This document defines the Infrastructure layer of Trading Platform Pro and its primary application, the Trading Cockpit.</w:t>
       </w:r>
     </w:p>
     <w:p>
@@ -49,7 +49,7 @@
         <w:pStyle w:val="BodyText"/>
       </w:pPr>
       <w:r>
-        <w:t xml:space="preserve">The Infrastructure layer provides the technical capabilities required by the application while remaining isolated from the business domain.</w:t>
+        <w:t xml:space="preserve">Infrastructure provides technical capabilities, external integrations and adapter implementations required by application workflows.</w:t>
       </w:r>
     </w:p>
     <w:p>
@@ -57,7 +57,7 @@
         <w:pStyle w:val="BodyText"/>
       </w:pPr>
       <w:r>
-        <w:t xml:space="preserve">It contains implementations of interfaces defined by the Domain and Application layers.</w:t>
+        <w:t xml:space="preserve">Infrastructure shall remain isolated from domain business rules and trading decisions.</w:t>
       </w:r>
     </w:p>
     <w:p>
@@ -68,13 +68,13 @@
       </w:r>
     </w:p>
     <w:bookmarkEnd w:id="10"/>
-    <w:bookmarkStart w:id="11" w:name="responsibilities"/>
+    <w:bookmarkStart w:id="11" w:name="infrastructure-responsibilities"/>
     <w:p>
       <w:pPr>
         <w:pStyle w:val="Heading1"/>
       </w:pPr>
       <w:r>
-        <w:t xml:space="preserve">Responsibilities</w:t>
+        <w:t xml:space="preserve">Infrastructure Responsibilities</w:t>
       </w:r>
     </w:p>
     <w:p>
@@ -82,7 +82,7 @@
         <w:pStyle w:val="FirstParagraph"/>
       </w:pPr>
       <w:r>
-        <w:t xml:space="preserve">Infrastructure is responsible for:</w:t>
+        <w:t xml:space="preserve">Infrastructure is responsible for technical capabilities including:</w:t>
       </w:r>
     </w:p>
     <w:p>
@@ -106,7 +106,7 @@
         </w:numPr>
       </w:pPr>
       <w:r>
-        <w:t xml:space="preserve">Logging</w:t>
+        <w:t xml:space="preserve">Structured Logging</w:t>
       </w:r>
     </w:p>
     <w:p>
@@ -142,6 +142,42 @@
         </w:numPr>
       </w:pPr>
       <w:r>
+        <w:t xml:space="preserve">Broker Integration</w:t>
+      </w:r>
+    </w:p>
+    <w:p>
+      <w:pPr>
+        <w:pStyle w:val="Compact"/>
+        <w:numPr>
+          <w:ilvl w:val="0"/>
+          <w:numId w:val="1001"/>
+        </w:numPr>
+      </w:pPr>
+      <w:r>
+        <w:t xml:space="preserve">Market Data Integration</w:t>
+      </w:r>
+    </w:p>
+    <w:p>
+      <w:pPr>
+        <w:pStyle w:val="Compact"/>
+        <w:numPr>
+          <w:ilvl w:val="0"/>
+          <w:numId w:val="1001"/>
+        </w:numPr>
+      </w:pPr>
+      <w:r>
+        <w:t xml:space="preserve">File System Access</w:t>
+      </w:r>
+    </w:p>
+    <w:p>
+      <w:pPr>
+        <w:pStyle w:val="Compact"/>
+        <w:numPr>
+          <w:ilvl w:val="0"/>
+          <w:numId w:val="1001"/>
+        </w:numPr>
+      </w:pPr>
+      <w:r>
         <w:t xml:space="preserve">Messaging</w:t>
       </w:r>
     </w:p>
@@ -154,7 +190,7 @@
         </w:numPr>
       </w:pPr>
       <w:r>
-        <w:t xml:space="preserve">File System</w:t>
+        <w:t xml:space="preserve">Runtime Services</w:t>
       </w:r>
     </w:p>
     <w:p>
@@ -166,7 +202,7 @@
         </w:numPr>
       </w:pPr>
       <w:r>
-        <w:t xml:space="preserve">Runtime Services</w:t>
+        <w:t xml:space="preserve">Scheduling</w:t>
       </w:r>
     </w:p>
     <w:p>
@@ -178,7 +214,7 @@
         </w:numPr>
       </w:pPr>
       <w:r>
-        <w:t xml:space="preserve">Scheduling</w:t>
+        <w:t xml:space="preserve">Monitoring</w:t>
       </w:r>
     </w:p>
     <w:p>
@@ -190,7 +226,7 @@
         </w:numPr>
       </w:pPr>
       <w:r>
-        <w:t xml:space="preserve">Monitoring</w:t>
+        <w:t xml:space="preserve">Health Checks</w:t>
       </w:r>
     </w:p>
     <w:p>
@@ -202,7 +238,7 @@
         </w:numPr>
       </w:pPr>
       <w:r>
-        <w:t xml:space="preserve">Health Checks</w:t>
+        <w:t xml:space="preserve">Serialization</w:t>
       </w:r>
     </w:p>
     <w:p>
@@ -214,7 +250,7 @@
         </w:numPr>
       </w:pPr>
       <w:r>
-        <w:t xml:space="preserve">Serialization</w:t>
+        <w:t xml:space="preserve">Security Integration</w:t>
       </w:r>
     </w:p>
     <w:p>
@@ -226,31 +262,15 @@
         </w:numPr>
       </w:pPr>
       <w:r>
-        <w:t xml:space="preserve">Plugin Management</w:t>
-      </w:r>
-    </w:p>
-    <w:p>
-      <w:pPr>
-        <w:pStyle w:val="Compact"/>
-        <w:numPr>
-          <w:ilvl w:val="0"/>
-          <w:numId w:val="1001"/>
-        </w:numPr>
-      </w:pPr>
-      <w:r>
         <w:t xml:space="preserve">External APIs</w:t>
       </w:r>
     </w:p>
     <w:p>
       <w:pPr>
-        <w:pStyle w:val="Compact"/>
-        <w:numPr>
-          <w:ilvl w:val="0"/>
-          <w:numId w:val="1001"/>
-        </w:numPr>
-      </w:pPr>
-      <w:r>
-        <w:t xml:space="preserve">Broker Integration</w:t>
+        <w:pStyle w:val="FirstParagraph"/>
+      </w:pPr>
+      <w:r>
+        <w:t xml:space="preserve">Infrastructure implements ports and technical abstractions defined by the Application or Domain layers where appropriate.</w:t>
       </w:r>
     </w:p>
     <w:p>
@@ -261,13 +281,13 @@
       </w:r>
     </w:p>
     <w:bookmarkEnd w:id="11"/>
-    <w:bookmarkStart w:id="12" w:name="design-principles"/>
+    <w:bookmarkStart w:id="12" w:name="infrastructure-principles"/>
     <w:p>
       <w:pPr>
         <w:pStyle w:val="Heading1"/>
       </w:pPr>
       <w:r>
-        <w:t xml:space="preserve">Design Principles</w:t>
+        <w:t xml:space="preserve">Infrastructure Principles</w:t>
       </w:r>
     </w:p>
     <w:p>
@@ -287,7 +307,7 @@
         </w:numPr>
       </w:pPr>
       <w:r>
-        <w:t xml:space="preserve">implement interfaces</w:t>
+        <w:t xml:space="preserve">isolate external dependencies</w:t>
       </w:r>
     </w:p>
     <w:p>
@@ -299,7 +319,7 @@
         </w:numPr>
       </w:pPr>
       <w:r>
-        <w:t xml:space="preserve">remain replaceable</w:t>
+        <w:t xml:space="preserve">implement explicit ports</w:t>
       </w:r>
     </w:p>
     <w:p>
@@ -311,7 +331,7 @@
         </w:numPr>
       </w:pPr>
       <w:r>
-        <w:t xml:space="preserve">contain no business rules</w:t>
+        <w:t xml:space="preserve">remain replaceable where practical</w:t>
       </w:r>
     </w:p>
     <w:p>
@@ -323,7 +343,7 @@
         </w:numPr>
       </w:pPr>
       <w:r>
-        <w:t xml:space="preserve">isolate external dependencies</w:t>
+        <w:t xml:space="preserve">contain no trading decisions</w:t>
       </w:r>
     </w:p>
     <w:p>
@@ -335,7 +355,55 @@
         </w:numPr>
       </w:pPr>
       <w:r>
-        <w:t xml:space="preserve">support automated testing</w:t>
+        <w:t xml:space="preserve">contain no domain business rules</w:t>
+      </w:r>
+    </w:p>
+    <w:p>
+      <w:pPr>
+        <w:pStyle w:val="Compact"/>
+        <w:numPr>
+          <w:ilvl w:val="0"/>
+          <w:numId w:val="1002"/>
+        </w:numPr>
+      </w:pPr>
+      <w:r>
+        <w:t xml:space="preserve">expose operational state</w:t>
+      </w:r>
+    </w:p>
+    <w:p>
+      <w:pPr>
+        <w:pStyle w:val="Compact"/>
+        <w:numPr>
+          <w:ilvl w:val="0"/>
+          <w:numId w:val="1002"/>
+        </w:numPr>
+      </w:pPr>
+      <w:r>
+        <w:t xml:space="preserve">expose technical failures</w:t>
+      </w:r>
+    </w:p>
+    <w:p>
+      <w:pPr>
+        <w:pStyle w:val="Compact"/>
+        <w:numPr>
+          <w:ilvl w:val="0"/>
+          <w:numId w:val="1002"/>
+        </w:numPr>
+      </w:pPr>
+      <w:r>
+        <w:t xml:space="preserve">support deterministic testing</w:t>
+      </w:r>
+    </w:p>
+    <w:p>
+      <w:pPr>
+        <w:pStyle w:val="Compact"/>
+        <w:numPr>
+          <w:ilvl w:val="0"/>
+          <w:numId w:val="1002"/>
+        </w:numPr>
+      </w:pPr>
+      <w:r>
+        <w:t xml:space="preserve">support controlled lifecycle management</w:t>
       </w:r>
     </w:p>
     <w:p>
@@ -343,7 +411,7 @@
         <w:pStyle w:val="FirstParagraph"/>
       </w:pPr>
       <w:r>
-        <w:t xml:space="preserve">Business decisions always belong to the Domain.</w:t>
+        <w:t xml:space="preserve">Infrastructure shall not silently alter business state.</w:t>
       </w:r>
     </w:p>
     <w:p>
@@ -354,13 +422,13 @@
       </w:r>
     </w:p>
     <w:bookmarkEnd w:id="12"/>
-    <w:bookmarkStart w:id="13" w:name="infrastructure-packages"/>
+    <w:bookmarkStart w:id="13" w:name="infrastructure-boundaries"/>
     <w:p>
       <w:pPr>
         <w:pStyle w:val="Heading1"/>
       </w:pPr>
       <w:r>
-        <w:t xml:space="preserve">Infrastructure Packages</w:t>
+        <w:t xml:space="preserve">Infrastructure Boundaries</w:t>
       </w:r>
     </w:p>
     <w:p>
@@ -368,162 +436,67 @@
         <w:pStyle w:val="FirstParagraph"/>
       </w:pPr>
       <w:r>
-        <w:t xml:space="preserve">Typical packages include:</w:t>
-      </w:r>
-    </w:p>
-    <w:p>
-      <w:pPr>
-        <w:pStyle w:val="SourceCode"/>
-      </w:pPr>
-      <w:r>
-        <w:rPr>
-          <w:rStyle w:val="VerbatimChar"/>
-        </w:rPr>
-        <w:t xml:space="preserve">bootstrap/</w:t>
-      </w:r>
-      <w:r>
-        <w:br/>
-      </w:r>
-      <w:r>
-        <w:rPr>
-          <w:rStyle w:val="VerbatimChar"/>
-        </w:rPr>
-        <w:t xml:space="preserve">cache/</w:t>
-      </w:r>
-      <w:r>
-        <w:br/>
-      </w:r>
-      <w:r>
-        <w:rPr>
-          <w:rStyle w:val="VerbatimChar"/>
-        </w:rPr>
-        <w:t xml:space="preserve">clock/</w:t>
-      </w:r>
-      <w:r>
-        <w:br/>
-      </w:r>
-      <w:r>
-        <w:rPr>
-          <w:rStyle w:val="VerbatimChar"/>
-        </w:rPr>
-        <w:t xml:space="preserve">config/</w:t>
-      </w:r>
-      <w:r>
-        <w:br/>
-      </w:r>
-      <w:r>
-        <w:rPr>
-          <w:rStyle w:val="VerbatimChar"/>
-        </w:rPr>
-        <w:t xml:space="preserve">files/</w:t>
-      </w:r>
-      <w:r>
-        <w:br/>
-      </w:r>
-      <w:r>
-        <w:rPr>
-          <w:rStyle w:val="VerbatimChar"/>
-        </w:rPr>
-        <w:t xml:space="preserve">health/</w:t>
-      </w:r>
-      <w:r>
-        <w:br/>
-      </w:r>
-      <w:r>
-        <w:rPr>
-          <w:rStyle w:val="VerbatimChar"/>
-        </w:rPr>
-        <w:t xml:space="preserve">identity/</w:t>
-      </w:r>
-      <w:r>
-        <w:br/>
-      </w:r>
-      <w:r>
-        <w:rPr>
-          <w:rStyle w:val="VerbatimChar"/>
-        </w:rPr>
-        <w:t xml:space="preserve">logging/</w:t>
-      </w:r>
-      <w:r>
-        <w:br/>
-      </w:r>
-      <w:r>
-        <w:rPr>
-          <w:rStyle w:val="VerbatimChar"/>
-        </w:rPr>
-        <w:t xml:space="preserve">messaging/</w:t>
-      </w:r>
-      <w:r>
-        <w:br/>
-      </w:r>
-      <w:r>
-        <w:rPr>
-          <w:rStyle w:val="VerbatimChar"/>
-        </w:rPr>
-        <w:t xml:space="preserve">monitoring/</w:t>
-      </w:r>
-      <w:r>
-        <w:br/>
-      </w:r>
-      <w:r>
-        <w:rPr>
-          <w:rStyle w:val="VerbatimChar"/>
-        </w:rPr>
-        <w:t xml:space="preserve">plugins/</w:t>
-      </w:r>
-      <w:r>
-        <w:br/>
-      </w:r>
-      <w:r>
-        <w:rPr>
-          <w:rStyle w:val="VerbatimChar"/>
-        </w:rPr>
-        <w:t xml:space="preserve">resources/</w:t>
-      </w:r>
-      <w:r>
-        <w:br/>
-      </w:r>
-      <w:r>
-        <w:rPr>
-          <w:rStyle w:val="VerbatimChar"/>
-        </w:rPr>
-        <w:t xml:space="preserve">runtime/</w:t>
-      </w:r>
-      <w:r>
-        <w:br/>
-      </w:r>
-      <w:r>
-        <w:rPr>
-          <w:rStyle w:val="VerbatimChar"/>
-        </w:rPr>
-        <w:t xml:space="preserve">scheduler/</w:t>
-      </w:r>
-      <w:r>
-        <w:br/>
-      </w:r>
-      <w:r>
-        <w:rPr>
-          <w:rStyle w:val="VerbatimChar"/>
-        </w:rPr>
-        <w:t xml:space="preserve">security/</w:t>
-      </w:r>
-      <w:r>
-        <w:br/>
-      </w:r>
-      <w:r>
-        <w:rPr>
-          <w:rStyle w:val="VerbatimChar"/>
-        </w:rPr>
-        <w:t xml:space="preserve">serialization/</w:t>
-      </w:r>
-      <w:r>
-        <w:br/>
-      </w:r>
-      <w:r>
-        <w:rPr>
-          <w:rStyle w:val="VerbatimChar"/>
-        </w:rPr>
-        <w:t xml:space="preserve">transactions/</w:t>
+        <w:t xml:space="preserve">Infrastructure may translate:</w:t>
+      </w:r>
+    </w:p>
+    <w:p>
+      <w:pPr>
+        <w:pStyle w:val="Compact"/>
+        <w:numPr>
+          <w:ilvl w:val="0"/>
+          <w:numId w:val="1003"/>
+        </w:numPr>
+      </w:pPr>
+      <w:r>
+        <w:t xml:space="preserve">external data</w:t>
+      </w:r>
+    </w:p>
+    <w:p>
+      <w:pPr>
+        <w:pStyle w:val="Compact"/>
+        <w:numPr>
+          <w:ilvl w:val="0"/>
+          <w:numId w:val="1003"/>
+        </w:numPr>
+      </w:pPr>
+      <w:r>
+        <w:t xml:space="preserve">provider identifiers</w:t>
+      </w:r>
+    </w:p>
+    <w:p>
+      <w:pPr>
+        <w:pStyle w:val="Compact"/>
+        <w:numPr>
+          <w:ilvl w:val="0"/>
+          <w:numId w:val="1003"/>
+        </w:numPr>
+      </w:pPr>
+      <w:r>
+        <w:t xml:space="preserve">transport errors</w:t>
+      </w:r>
+    </w:p>
+    <w:p>
+      <w:pPr>
+        <w:pStyle w:val="Compact"/>
+        <w:numPr>
+          <w:ilvl w:val="0"/>
+          <w:numId w:val="1003"/>
+        </w:numPr>
+      </w:pPr>
+      <w:r>
+        <w:t xml:space="preserve">persistence records</w:t>
+      </w:r>
+    </w:p>
+    <w:p>
+      <w:pPr>
+        <w:pStyle w:val="Compact"/>
+        <w:numPr>
+          <w:ilvl w:val="0"/>
+          <w:numId w:val="1003"/>
+        </w:numPr>
+      </w:pPr>
+      <w:r>
+        <w:t xml:space="preserve">technical connection state</w:t>
       </w:r>
     </w:p>
     <w:p>
@@ -531,7 +504,75 @@
         <w:pStyle w:val="FirstParagraph"/>
       </w:pPr>
       <w:r>
-        <w:t xml:space="preserve">Each package has a single technical responsibility.</w:t>
+        <w:t xml:space="preserve">Infrastructure shall not decide:</w:t>
+      </w:r>
+    </w:p>
+    <w:p>
+      <w:pPr>
+        <w:pStyle w:val="Compact"/>
+        <w:numPr>
+          <w:ilvl w:val="0"/>
+          <w:numId w:val="1004"/>
+        </w:numPr>
+      </w:pPr>
+      <w:r>
+        <w:t xml:space="preserve">whether a trading candidate is accepted</w:t>
+      </w:r>
+    </w:p>
+    <w:p>
+      <w:pPr>
+        <w:pStyle w:val="Compact"/>
+        <w:numPr>
+          <w:ilvl w:val="0"/>
+          <w:numId w:val="1004"/>
+        </w:numPr>
+      </w:pPr>
+      <w:r>
+        <w:t xml:space="preserve">whether a trading decision is valid</w:t>
+      </w:r>
+    </w:p>
+    <w:p>
+      <w:pPr>
+        <w:pStyle w:val="Compact"/>
+        <w:numPr>
+          <w:ilvl w:val="0"/>
+          <w:numId w:val="1004"/>
+        </w:numPr>
+      </w:pPr>
+      <w:r>
+        <w:t xml:space="preserve">whether portfolio risk is acceptable</w:t>
+      </w:r>
+    </w:p>
+    <w:p>
+      <w:pPr>
+        <w:pStyle w:val="Compact"/>
+        <w:numPr>
+          <w:ilvl w:val="0"/>
+          <w:numId w:val="1004"/>
+        </w:numPr>
+      </w:pPr>
+      <w:r>
+        <w:t xml:space="preserve">whether an order should be submitted</w:t>
+      </w:r>
+    </w:p>
+    <w:p>
+      <w:pPr>
+        <w:pStyle w:val="Compact"/>
+        <w:numPr>
+          <w:ilvl w:val="0"/>
+          <w:numId w:val="1004"/>
+        </w:numPr>
+      </w:pPr>
+      <w:r>
+        <w:t xml:space="preserve">whether a position should be closed</w:t>
+      </w:r>
+    </w:p>
+    <w:p>
+      <w:pPr>
+        <w:pStyle w:val="FirstParagraph"/>
+      </w:pPr>
+      <w:r>
+        <w:t xml:space="preserve">These decisions belong to Domain or Application workflows.</w:t>
       </w:r>
     </w:p>
     <w:p>
@@ -542,13 +583,13 @@
       </w:r>
     </w:p>
     <w:bookmarkEnd w:id="13"/>
-    <w:bookmarkStart w:id="14" w:name="external-dependencies"/>
+    <w:bookmarkStart w:id="14" w:name="adapter-architecture"/>
     <w:p>
       <w:pPr>
         <w:pStyle w:val="Heading1"/>
       </w:pPr>
       <w:r>
-        <w:t xml:space="preserve">External Dependencies</w:t>
+        <w:t xml:space="preserve">Adapter Architecture</w:t>
       </w:r>
     </w:p>
     <w:p>
@@ -556,953 +597,60 @@
         <w:pStyle w:val="FirstParagraph"/>
       </w:pPr>
       <w:r>
-        <w:t xml:space="preserve">Infrastructure communicates with external systems such as:</w:t>
-      </w:r>
-    </w:p>
-    <w:p>
-      <w:pPr>
-        <w:pStyle w:val="Compact"/>
-        <w:numPr>
-          <w:ilvl w:val="0"/>
-          <w:numId w:val="1003"/>
-        </w:numPr>
-      </w:pPr>
-      <w:r>
-        <w:t xml:space="preserve">File System</w:t>
-      </w:r>
-    </w:p>
-    <w:p>
-      <w:pPr>
-        <w:pStyle w:val="Compact"/>
-        <w:numPr>
-          <w:ilvl w:val="0"/>
-          <w:numId w:val="1003"/>
-        </w:numPr>
-      </w:pPr>
-      <w:r>
-        <w:t xml:space="preserve">Databases</w:t>
-      </w:r>
-    </w:p>
-    <w:p>
-      <w:pPr>
-        <w:pStyle w:val="Compact"/>
-        <w:numPr>
-          <w:ilvl w:val="0"/>
-          <w:numId w:val="1003"/>
-        </w:numPr>
-      </w:pPr>
-      <w:r>
-        <w:t xml:space="preserve">Broker APIs</w:t>
-      </w:r>
-    </w:p>
-    <w:p>
-      <w:pPr>
-        <w:pStyle w:val="Compact"/>
-        <w:numPr>
-          <w:ilvl w:val="0"/>
-          <w:numId w:val="1003"/>
-        </w:numPr>
-      </w:pPr>
-      <w:r>
-        <w:t xml:space="preserve">Market Data Providers</w:t>
-      </w:r>
-    </w:p>
-    <w:p>
-      <w:pPr>
-        <w:pStyle w:val="Compact"/>
-        <w:numPr>
-          <w:ilvl w:val="0"/>
-          <w:numId w:val="1003"/>
-        </w:numPr>
-      </w:pPr>
-      <w:r>
-        <w:t xml:space="preserve">Operating System</w:t>
-      </w:r>
-    </w:p>
-    <w:p>
-      <w:pPr>
-        <w:pStyle w:val="Compact"/>
-        <w:numPr>
-          <w:ilvl w:val="0"/>
-          <w:numId w:val="1003"/>
-        </w:numPr>
-      </w:pPr>
-      <w:r>
-        <w:t xml:space="preserve">Network Services</w:t>
-      </w:r>
-    </w:p>
-    <w:p>
-      <w:pPr>
-        <w:pStyle w:val="FirstParagraph"/>
-      </w:pPr>
-      <w:r>
-        <w:t xml:space="preserve">These dependencies are isolated from the Domain.</w:t>
-      </w:r>
-    </w:p>
-    <w:p>
-      <w:r>
-        <w:pict>
-          <v:rect style="width:0;height:1.5pt" o:hralign="center" o:hrstd="t" o:hr="t"/>
-        </w:pict>
+        <w:t xml:space="preserve">External systems shall be accessed through explicit adapters.</w:t>
+      </w:r>
+    </w:p>
+    <w:p>
+      <w:pPr>
+        <w:pStyle w:val="BodyText"/>
+      </w:pPr>
+      <w:r>
+        <w:t xml:space="preserve">```text</w:t>
+      </w:r>
+      <w:r>
+        <w:t xml:space="preserve"> </w:t>
+      </w:r>
+      <w:r>
+        <w:t xml:space="preserve">Application Port</w:t>
+      </w:r>
+      <w:r>
+        <w:t xml:space="preserve"> </w:t>
+      </w:r>
+      <w:r>
+        <w:t xml:space="preserve">│</w:t>
+      </w:r>
+      <w:r>
+        <w:t xml:space="preserve"> </w:t>
+      </w:r>
+      <w:r>
+        <w:t xml:space="preserve">▼</w:t>
+      </w:r>
+      <w:r>
+        <w:t xml:space="preserve"> </w:t>
+      </w:r>
+      <w:r>
+        <w:t xml:space="preserve">Infrastructure Adapter</w:t>
+      </w:r>
+      <w:r>
+        <w:t xml:space="preserve"> </w:t>
+      </w:r>
+      <w:r>
+        <w:t xml:space="preserve">│</w:t>
+      </w:r>
+      <w:r>
+        <w:t xml:space="preserve"> </w:t>
+      </w:r>
+      <w:r>
+        <w:t xml:space="preserve">▼</w:t>
+      </w:r>
+      <w:r>
+        <w:t xml:space="preserve"> </w:t>
+      </w:r>
+      <w:r>
+        <w:t xml:space="preserve">External System</w:t>
       </w:r>
     </w:p>
     <w:bookmarkEnd w:id="14"/>
-    <w:bookmarkStart w:id="15" w:name="dependency-injection"/>
-    <w:p>
-      <w:pPr>
-        <w:pStyle w:val="Heading1"/>
-      </w:pPr>
-      <w:r>
-        <w:t xml:space="preserve">Dependency Injection</w:t>
-      </w:r>
-    </w:p>
-    <w:p>
-      <w:pPr>
-        <w:pStyle w:val="FirstParagraph"/>
-      </w:pPr>
-      <w:r>
-        <w:t xml:space="preserve">Infrastructure services are registered during application startup.</w:t>
-      </w:r>
-    </w:p>
-    <w:p>
-      <w:pPr>
-        <w:pStyle w:val="BodyText"/>
-      </w:pPr>
-      <w:r>
-        <w:t xml:space="preserve">Service creation is centralized to:</w:t>
-      </w:r>
-    </w:p>
-    <w:p>
-      <w:pPr>
-        <w:pStyle w:val="Compact"/>
-        <w:numPr>
-          <w:ilvl w:val="0"/>
-          <w:numId w:val="1004"/>
-        </w:numPr>
-      </w:pPr>
-      <w:r>
-        <w:t xml:space="preserve">simplify testing</w:t>
-      </w:r>
-    </w:p>
-    <w:p>
-      <w:pPr>
-        <w:pStyle w:val="Compact"/>
-        <w:numPr>
-          <w:ilvl w:val="0"/>
-          <w:numId w:val="1004"/>
-        </w:numPr>
-      </w:pPr>
-      <w:r>
-        <w:t xml:space="preserve">improve maintainability</w:t>
-      </w:r>
-    </w:p>
-    <w:p>
-      <w:pPr>
-        <w:pStyle w:val="Compact"/>
-        <w:numPr>
-          <w:ilvl w:val="0"/>
-          <w:numId w:val="1004"/>
-        </w:numPr>
-      </w:pPr>
-      <w:r>
-        <w:t xml:space="preserve">avoid hidden dependencies</w:t>
-      </w:r>
-    </w:p>
-    <w:p>
-      <w:r>
-        <w:pict>
-          <v:rect style="width:0;height:1.5pt" o:hralign="center" o:hrstd="t" o:hr="t"/>
-        </w:pict>
-      </w:r>
-    </w:p>
-    <w:bookmarkEnd w:id="15"/>
-    <w:bookmarkStart w:id="16" w:name="persistence"/>
-    <w:p>
-      <w:pPr>
-        <w:pStyle w:val="Heading1"/>
-      </w:pPr>
-      <w:r>
-        <w:t xml:space="preserve">Persistence</w:t>
-      </w:r>
-    </w:p>
-    <w:p>
-      <w:pPr>
-        <w:pStyle w:val="FirstParagraph"/>
-      </w:pPr>
-      <w:r>
-        <w:t xml:space="preserve">Persistence implementations belong exclusively to Infrastructure.</w:t>
-      </w:r>
-    </w:p>
-    <w:p>
-      <w:pPr>
-        <w:pStyle w:val="BodyText"/>
-      </w:pPr>
-      <w:r>
-        <w:t xml:space="preserve">Typical responsibilities:</w:t>
-      </w:r>
-    </w:p>
-    <w:p>
-      <w:pPr>
-        <w:pStyle w:val="Compact"/>
-        <w:numPr>
-          <w:ilvl w:val="0"/>
-          <w:numId w:val="1005"/>
-        </w:numPr>
-      </w:pPr>
-      <w:r>
-        <w:t xml:space="preserve">repositories</w:t>
-      </w:r>
-    </w:p>
-    <w:p>
-      <w:pPr>
-        <w:pStyle w:val="Compact"/>
-        <w:numPr>
-          <w:ilvl w:val="0"/>
-          <w:numId w:val="1005"/>
-        </w:numPr>
-      </w:pPr>
-      <w:r>
-        <w:t xml:space="preserve">file storage</w:t>
-      </w:r>
-    </w:p>
-    <w:p>
-      <w:pPr>
-        <w:pStyle w:val="Compact"/>
-        <w:numPr>
-          <w:ilvl w:val="0"/>
-          <w:numId w:val="1005"/>
-        </w:numPr>
-      </w:pPr>
-      <w:r>
-        <w:t xml:space="preserve">configuration loading</w:t>
-      </w:r>
-    </w:p>
-    <w:p>
-      <w:pPr>
-        <w:pStyle w:val="Compact"/>
-        <w:numPr>
-          <w:ilvl w:val="0"/>
-          <w:numId w:val="1005"/>
-        </w:numPr>
-      </w:pPr>
-      <w:r>
-        <w:t xml:space="preserve">serialization</w:t>
-      </w:r>
-    </w:p>
-    <w:p>
-      <w:r>
-        <w:pict>
-          <v:rect style="width:0;height:1.5pt" o:hralign="center" o:hrstd="t" o:hr="t"/>
-        </w:pict>
-      </w:r>
-    </w:p>
-    <w:bookmarkEnd w:id="16"/>
-    <w:bookmarkStart w:id="17" w:name="messaging"/>
-    <w:p>
-      <w:pPr>
-        <w:pStyle w:val="Heading1"/>
-      </w:pPr>
-      <w:r>
-        <w:t xml:space="preserve">Messaging</w:t>
-      </w:r>
-    </w:p>
-    <w:p>
-      <w:pPr>
-        <w:pStyle w:val="FirstParagraph"/>
-      </w:pPr>
-      <w:r>
-        <w:t xml:space="preserve">Messaging enables communication between components without introducing tight coupling.</w:t>
-      </w:r>
-    </w:p>
-    <w:p>
-      <w:pPr>
-        <w:pStyle w:val="BodyText"/>
-      </w:pPr>
-      <w:r>
-        <w:t xml:space="preserve">Examples:</w:t>
-      </w:r>
-    </w:p>
-    <w:p>
-      <w:pPr>
-        <w:pStyle w:val="Compact"/>
-        <w:numPr>
-          <w:ilvl w:val="0"/>
-          <w:numId w:val="1006"/>
-        </w:numPr>
-      </w:pPr>
-      <w:r>
-        <w:t xml:space="preserve">domain events</w:t>
-      </w:r>
-    </w:p>
-    <w:p>
-      <w:pPr>
-        <w:pStyle w:val="Compact"/>
-        <w:numPr>
-          <w:ilvl w:val="0"/>
-          <w:numId w:val="1006"/>
-        </w:numPr>
-      </w:pPr>
-      <w:r>
-        <w:t xml:space="preserve">application events</w:t>
-      </w:r>
-    </w:p>
-    <w:p>
-      <w:pPr>
-        <w:pStyle w:val="Compact"/>
-        <w:numPr>
-          <w:ilvl w:val="0"/>
-          <w:numId w:val="1006"/>
-        </w:numPr>
-      </w:pPr>
-      <w:r>
-        <w:t xml:space="preserve">notifications</w:t>
-      </w:r>
-    </w:p>
-    <w:p>
-      <w:r>
-        <w:pict>
-          <v:rect style="width:0;height:1.5pt" o:hralign="center" o:hrstd="t" o:hr="t"/>
-        </w:pict>
-      </w:r>
-    </w:p>
-    <w:bookmarkEnd w:id="17"/>
-    <w:bookmarkStart w:id="18" w:name="runtime-services"/>
-    <w:p>
-      <w:pPr>
-        <w:pStyle w:val="Heading1"/>
-      </w:pPr>
-      <w:r>
-        <w:t xml:space="preserve">Runtime Services</w:t>
-      </w:r>
-    </w:p>
-    <w:p>
-      <w:pPr>
-        <w:pStyle w:val="FirstParagraph"/>
-      </w:pPr>
-      <w:r>
-        <w:t xml:space="preserve">Infrastructure provides shared runtime functionality such as:</w:t>
-      </w:r>
-    </w:p>
-    <w:p>
-      <w:pPr>
-        <w:pStyle w:val="Compact"/>
-        <w:numPr>
-          <w:ilvl w:val="0"/>
-          <w:numId w:val="1007"/>
-        </w:numPr>
-      </w:pPr>
-      <w:r>
-        <w:t xml:space="preserve">clocks</w:t>
-      </w:r>
-    </w:p>
-    <w:p>
-      <w:pPr>
-        <w:pStyle w:val="Compact"/>
-        <w:numPr>
-          <w:ilvl w:val="0"/>
-          <w:numId w:val="1007"/>
-        </w:numPr>
-      </w:pPr>
-      <w:r>
-        <w:t xml:space="preserve">schedulers</w:t>
-      </w:r>
-    </w:p>
-    <w:p>
-      <w:pPr>
-        <w:pStyle w:val="Compact"/>
-        <w:numPr>
-          <w:ilvl w:val="0"/>
-          <w:numId w:val="1007"/>
-        </w:numPr>
-      </w:pPr>
-      <w:r>
-        <w:t xml:space="preserve">monitoring</w:t>
-      </w:r>
-    </w:p>
-    <w:p>
-      <w:pPr>
-        <w:pStyle w:val="Compact"/>
-        <w:numPr>
-          <w:ilvl w:val="0"/>
-          <w:numId w:val="1007"/>
-        </w:numPr>
-      </w:pPr>
-      <w:r>
-        <w:t xml:space="preserve">health checks</w:t>
-      </w:r>
-    </w:p>
-    <w:p>
-      <w:pPr>
-        <w:pStyle w:val="Compact"/>
-        <w:numPr>
-          <w:ilvl w:val="0"/>
-          <w:numId w:val="1007"/>
-        </w:numPr>
-      </w:pPr>
-      <w:r>
-        <w:t xml:space="preserve">diagnostics</w:t>
-      </w:r>
-    </w:p>
-    <w:p>
-      <w:r>
-        <w:pict>
-          <v:rect style="width:0;height:1.5pt" o:hralign="center" o:hrstd="t" o:hr="t"/>
-        </w:pict>
-      </w:r>
-    </w:p>
-    <w:bookmarkEnd w:id="18"/>
-    <w:bookmarkStart w:id="19" w:name="testing"/>
-    <w:p>
-      <w:pPr>
-        <w:pStyle w:val="Heading1"/>
-      </w:pPr>
-      <w:r>
-        <w:t xml:space="preserve">Testing</w:t>
-      </w:r>
-    </w:p>
-    <w:p>
-      <w:pPr>
-        <w:pStyle w:val="FirstParagraph"/>
-      </w:pPr>
-      <w:r>
-        <w:t xml:space="preserve">Infrastructure components should be:</w:t>
-      </w:r>
-    </w:p>
-    <w:p>
-      <w:pPr>
-        <w:pStyle w:val="Compact"/>
-        <w:numPr>
-          <w:ilvl w:val="0"/>
-          <w:numId w:val="1008"/>
-        </w:numPr>
-      </w:pPr>
-      <w:r>
-        <w:t xml:space="preserve">independently testable</w:t>
-      </w:r>
-    </w:p>
-    <w:p>
-      <w:pPr>
-        <w:pStyle w:val="Compact"/>
-        <w:numPr>
-          <w:ilvl w:val="0"/>
-          <w:numId w:val="1008"/>
-        </w:numPr>
-      </w:pPr>
-      <w:r>
-        <w:t xml:space="preserve">mockable</w:t>
-      </w:r>
-    </w:p>
-    <w:p>
-      <w:pPr>
-        <w:pStyle w:val="Compact"/>
-        <w:numPr>
-          <w:ilvl w:val="0"/>
-          <w:numId w:val="1008"/>
-        </w:numPr>
-      </w:pPr>
-      <w:r>
-        <w:t xml:space="preserve">deterministic where possible</w:t>
-      </w:r>
-    </w:p>
-    <w:p>
-      <w:pPr>
-        <w:pStyle w:val="FirstParagraph"/>
-      </w:pPr>
-      <w:r>
-        <w:t xml:space="preserve">External systems should always be abstracted behind interfaces.</w:t>
-      </w:r>
-    </w:p>
-    <w:p>
-      <w:r>
-        <w:pict>
-          <v:rect style="width:0;height:1.5pt" o:hralign="center" o:hrstd="t" o:hr="t"/>
-        </w:pict>
-      </w:r>
-    </w:p>
-    <w:bookmarkEnd w:id="19"/>
-    <w:bookmarkStart w:id="20" w:name="evolution"/>
-    <w:p>
-      <w:pPr>
-        <w:pStyle w:val="Heading1"/>
-      </w:pPr>
-      <w:r>
-        <w:t xml:space="preserve">Evolution</w:t>
-      </w:r>
-    </w:p>
-    <w:p>
-      <w:pPr>
-        <w:pStyle w:val="FirstParagraph"/>
-      </w:pPr>
-      <w:r>
-        <w:t xml:space="preserve">New infrastructure modules should:</w:t>
-      </w:r>
-    </w:p>
-    <w:p>
-      <w:pPr>
-        <w:pStyle w:val="Compact"/>
-        <w:numPr>
-          <w:ilvl w:val="0"/>
-          <w:numId w:val="1009"/>
-        </w:numPr>
-      </w:pPr>
-      <w:r>
-        <w:t xml:space="preserve">remain loosely coupled</w:t>
-      </w:r>
-    </w:p>
-    <w:p>
-      <w:pPr>
-        <w:pStyle w:val="Compact"/>
-        <w:numPr>
-          <w:ilvl w:val="0"/>
-          <w:numId w:val="1009"/>
-        </w:numPr>
-      </w:pPr>
-      <w:r>
-        <w:t xml:space="preserve">follow existing package conventions</w:t>
-      </w:r>
-    </w:p>
-    <w:p>
-      <w:pPr>
-        <w:pStyle w:val="Compact"/>
-        <w:numPr>
-          <w:ilvl w:val="0"/>
-          <w:numId w:val="1009"/>
-        </w:numPr>
-      </w:pPr>
-      <w:r>
-        <w:t xml:space="preserve">avoid unnecessary dependencies</w:t>
-      </w:r>
-    </w:p>
-    <w:p>
-      <w:pPr>
-        <w:pStyle w:val="Compact"/>
-        <w:numPr>
-          <w:ilvl w:val="0"/>
-          <w:numId w:val="1009"/>
-        </w:numPr>
-      </w:pPr>
-      <w:r>
-        <w:t xml:space="preserve">preserve architectural consistency</w:t>
-      </w:r>
-    </w:p>
-    <w:p>
-      <w:r>
-        <w:pict>
-          <v:rect style="width:0;height:1.5pt" o:hralign="center" o:hrstd="t" o:hr="t"/>
-        </w:pict>
-      </w:r>
-    </w:p>
-    <w:bookmarkEnd w:id="20"/>
-    <w:bookmarkStart w:id="21" w:name="infrastructure-boundaries"/>
-    <w:p>
-      <w:pPr>
-        <w:pStyle w:val="Heading1"/>
-      </w:pPr>
-      <w:r>
-        <w:t xml:space="preserve">Infrastructure Boundaries</w:t>
-      </w:r>
-    </w:p>
-    <w:p>
-      <w:pPr>
-        <w:pStyle w:val="FirstParagraph"/>
-      </w:pPr>
-      <w:r>
-        <w:t xml:space="preserve">Infrastructure provides technical capabilities only.</w:t>
-      </w:r>
-    </w:p>
-    <w:p>
-      <w:pPr>
-        <w:pStyle w:val="BodyText"/>
-      </w:pPr>
-      <w:r>
-        <w:t xml:space="preserve">It must never contain:</w:t>
-      </w:r>
-    </w:p>
-    <w:p>
-      <w:pPr>
-        <w:pStyle w:val="Compact"/>
-        <w:numPr>
-          <w:ilvl w:val="0"/>
-          <w:numId w:val="1010"/>
-        </w:numPr>
-      </w:pPr>
-      <w:r>
-        <w:t xml:space="preserve">business rules</w:t>
-      </w:r>
-    </w:p>
-    <w:p>
-      <w:pPr>
-        <w:pStyle w:val="Compact"/>
-        <w:numPr>
-          <w:ilvl w:val="0"/>
-          <w:numId w:val="1010"/>
-        </w:numPr>
-      </w:pPr>
-      <w:r>
-        <w:t xml:space="preserve">trading decisions</w:t>
-      </w:r>
-    </w:p>
-    <w:p>
-      <w:pPr>
-        <w:pStyle w:val="Compact"/>
-        <w:numPr>
-          <w:ilvl w:val="0"/>
-          <w:numId w:val="1010"/>
-        </w:numPr>
-      </w:pPr>
-      <w:r>
-        <w:t xml:space="preserve">domain validation</w:t>
-      </w:r>
-    </w:p>
-    <w:p>
-      <w:pPr>
-        <w:pStyle w:val="Compact"/>
-        <w:numPr>
-          <w:ilvl w:val="0"/>
-          <w:numId w:val="1010"/>
-        </w:numPr>
-      </w:pPr>
-      <w:r>
-        <w:t xml:space="preserve">business workflows</w:t>
-      </w:r>
-    </w:p>
-    <w:p>
-      <w:pPr>
-        <w:pStyle w:val="FirstParagraph"/>
-      </w:pPr>
-      <w:r>
-        <w:t xml:space="preserve">Business logic belongs exclusively to the Domain and Application layers.</w:t>
-      </w:r>
-    </w:p>
-    <w:p>
-      <w:r>
-        <w:pict>
-          <v:rect style="width:0;height:1.5pt" o:hralign="center" o:hrstd="t" o:hr="t"/>
-        </w:pict>
-      </w:r>
-    </w:p>
-    <w:bookmarkEnd w:id="21"/>
-    <w:bookmarkStart w:id="22" w:name="configuration-strategy"/>
-    <w:p>
-      <w:pPr>
-        <w:pStyle w:val="Heading1"/>
-      </w:pPr>
-      <w:r>
-        <w:t xml:space="preserve">Configuration Strategy</w:t>
-      </w:r>
-    </w:p>
-    <w:p>
-      <w:pPr>
-        <w:pStyle w:val="FirstParagraph"/>
-      </w:pPr>
-      <w:r>
-        <w:t xml:space="preserve">Configuration shall:</w:t>
-      </w:r>
-    </w:p>
-    <w:p>
-      <w:pPr>
-        <w:pStyle w:val="Compact"/>
-        <w:numPr>
-          <w:ilvl w:val="0"/>
-          <w:numId w:val="1011"/>
-        </w:numPr>
-      </w:pPr>
-      <w:r>
-        <w:t xml:space="preserve">support multiple environments</w:t>
-      </w:r>
-    </w:p>
-    <w:p>
-      <w:pPr>
-        <w:pStyle w:val="Compact"/>
-        <w:numPr>
-          <w:ilvl w:val="0"/>
-          <w:numId w:val="1011"/>
-        </w:numPr>
-      </w:pPr>
-      <w:r>
-        <w:t xml:space="preserve">remain externalized</w:t>
-      </w:r>
-    </w:p>
-    <w:p>
-      <w:pPr>
-        <w:pStyle w:val="Compact"/>
-        <w:numPr>
-          <w:ilvl w:val="0"/>
-          <w:numId w:val="1011"/>
-        </w:numPr>
-      </w:pPr>
-      <w:r>
-        <w:t xml:space="preserve">be validated during startup</w:t>
-      </w:r>
-    </w:p>
-    <w:p>
-      <w:pPr>
-        <w:pStyle w:val="Compact"/>
-        <w:numPr>
-          <w:ilvl w:val="0"/>
-          <w:numId w:val="1011"/>
-        </w:numPr>
-      </w:pPr>
-      <w:r>
-        <w:t xml:space="preserve">never contain secrets in source control</w:t>
-      </w:r>
-    </w:p>
-    <w:p>
-      <w:pPr>
-        <w:pStyle w:val="FirstParagraph"/>
-      </w:pPr>
-      <w:r>
-        <w:t xml:space="preserve">Use dedicated providers for secrets and credentials.</w:t>
-      </w:r>
-    </w:p>
-    <w:p>
-      <w:r>
-        <w:pict>
-          <v:rect style="width:0;height:1.5pt" o:hralign="center" o:hrstd="t" o:hr="t"/>
-        </w:pict>
-      </w:r>
-    </w:p>
-    <w:bookmarkEnd w:id="22"/>
-    <w:bookmarkStart w:id="23" w:name="resilience"/>
-    <w:p>
-      <w:pPr>
-        <w:pStyle w:val="Heading1"/>
-      </w:pPr>
-      <w:r>
-        <w:t xml:space="preserve">Resilience</w:t>
-      </w:r>
-    </w:p>
-    <w:p>
-      <w:pPr>
-        <w:pStyle w:val="FirstParagraph"/>
-      </w:pPr>
-      <w:r>
-        <w:t xml:space="preserve">Infrastructure components should:</w:t>
-      </w:r>
-    </w:p>
-    <w:p>
-      <w:pPr>
-        <w:pStyle w:val="Compact"/>
-        <w:numPr>
-          <w:ilvl w:val="0"/>
-          <w:numId w:val="1012"/>
-        </w:numPr>
-      </w:pPr>
-      <w:r>
-        <w:t xml:space="preserve">fail fast</w:t>
-      </w:r>
-    </w:p>
-    <w:p>
-      <w:pPr>
-        <w:pStyle w:val="Compact"/>
-        <w:numPr>
-          <w:ilvl w:val="0"/>
-          <w:numId w:val="1012"/>
-        </w:numPr>
-      </w:pPr>
-      <w:r>
-        <w:t xml:space="preserve">support graceful recovery</w:t>
-      </w:r>
-    </w:p>
-    <w:p>
-      <w:pPr>
-        <w:pStyle w:val="Compact"/>
-        <w:numPr>
-          <w:ilvl w:val="0"/>
-          <w:numId w:val="1012"/>
-        </w:numPr>
-      </w:pPr>
-      <w:r>
-        <w:t xml:space="preserve">provide meaningful diagnostics</w:t>
-      </w:r>
-    </w:p>
-    <w:p>
-      <w:pPr>
-        <w:pStyle w:val="Compact"/>
-        <w:numPr>
-          <w:ilvl w:val="0"/>
-          <w:numId w:val="1012"/>
-        </w:numPr>
-      </w:pPr>
-      <w:r>
-        <w:t xml:space="preserve">expose health information</w:t>
-      </w:r>
-    </w:p>
-    <w:p>
-      <w:pPr>
-        <w:pStyle w:val="Compact"/>
-        <w:numPr>
-          <w:ilvl w:val="0"/>
-          <w:numId w:val="1012"/>
-        </w:numPr>
-      </w:pPr>
-      <w:r>
-        <w:t xml:space="preserve">degrade gracefully where appropriate</w:t>
-      </w:r>
-    </w:p>
-    <w:p>
-      <w:r>
-        <w:pict>
-          <v:rect style="width:0;height:1.5pt" o:hralign="center" o:hrstd="t" o:hr="t"/>
-        </w:pict>
-      </w:r>
-    </w:p>
-    <w:bookmarkEnd w:id="23"/>
-    <w:bookmarkStart w:id="24" w:name="infrastructure-review-checklist"/>
-    <w:p>
-      <w:pPr>
-        <w:pStyle w:val="Heading1"/>
-      </w:pPr>
-      <w:r>
-        <w:t xml:space="preserve">Infrastructure Review Checklist</w:t>
-      </w:r>
-    </w:p>
-    <w:p>
-      <w:pPr>
-        <w:pStyle w:val="FirstParagraph"/>
-      </w:pPr>
-      <w:r>
-        <w:t xml:space="preserve">Before merging verify:</w:t>
-      </w:r>
-    </w:p>
-    <w:p>
-      <w:pPr>
-        <w:pStyle w:val="Compact"/>
-        <w:numPr>
-          <w:ilvl w:val="0"/>
-          <w:numId w:val="1013"/>
-        </w:numPr>
-      </w:pPr>
-      <w:r>
-        <w:t xml:space="preserve">no business logic introduced</w:t>
-      </w:r>
-    </w:p>
-    <w:p>
-      <w:pPr>
-        <w:pStyle w:val="Compact"/>
-        <w:numPr>
-          <w:ilvl w:val="0"/>
-          <w:numId w:val="1013"/>
-        </w:numPr>
-      </w:pPr>
-      <w:r>
-        <w:t xml:space="preserve">interfaces respected</w:t>
-      </w:r>
-    </w:p>
-    <w:p>
-      <w:pPr>
-        <w:pStyle w:val="Compact"/>
-        <w:numPr>
-          <w:ilvl w:val="0"/>
-          <w:numId w:val="1013"/>
-        </w:numPr>
-      </w:pPr>
-      <w:r>
-        <w:t xml:space="preserve">dependencies minimized</w:t>
-      </w:r>
-    </w:p>
-    <w:p>
-      <w:pPr>
-        <w:pStyle w:val="Compact"/>
-        <w:numPr>
-          <w:ilvl w:val="0"/>
-          <w:numId w:val="1013"/>
-        </w:numPr>
-      </w:pPr>
-      <w:r>
-        <w:t xml:space="preserve">external services abstracted</w:t>
-      </w:r>
-    </w:p>
-    <w:p>
-      <w:pPr>
-        <w:pStyle w:val="Compact"/>
-        <w:numPr>
-          <w:ilvl w:val="0"/>
-          <w:numId w:val="1013"/>
-        </w:numPr>
-      </w:pPr>
-      <w:r>
-        <w:t xml:space="preserve">deterministic behaviour preserved</w:t>
-      </w:r>
-    </w:p>
-    <w:p>
-      <w:pPr>
-        <w:pStyle w:val="Compact"/>
-        <w:numPr>
-          <w:ilvl w:val="0"/>
-          <w:numId w:val="1013"/>
-        </w:numPr>
-      </w:pPr>
-      <w:r>
-        <w:t xml:space="preserve">documentation updated</w:t>
-      </w:r>
-    </w:p>
-    <w:p>
-      <w:r>
-        <w:pict>
-          <v:rect style="width:0;height:1.5pt" o:hralign="center" o:hrstd="t" o:hr="t"/>
-        </w:pict>
-      </w:r>
-    </w:p>
-    <w:bookmarkEnd w:id="24"/>
-    <w:bookmarkStart w:id="25" w:name="related-documents"/>
-    <w:p>
-      <w:pPr>
-        <w:pStyle w:val="Heading1"/>
-      </w:pPr>
-      <w:r>
-        <w:t xml:space="preserve">Related Documents</w:t>
-      </w:r>
-    </w:p>
-    <w:p>
-      <w:pPr>
-        <w:pStyle w:val="Compact"/>
-        <w:numPr>
-          <w:ilvl w:val="0"/>
-          <w:numId w:val="1014"/>
-        </w:numPr>
-      </w:pPr>
-      <w:r>
-        <w:t xml:space="preserve">Architecture.md</w:t>
-      </w:r>
-    </w:p>
-    <w:p>
-      <w:pPr>
-        <w:pStyle w:val="Compact"/>
-        <w:numPr>
-          <w:ilvl w:val="0"/>
-          <w:numId w:val="1014"/>
-        </w:numPr>
-      </w:pPr>
-      <w:r>
-        <w:t xml:space="preserve">Project_Structure.md</w:t>
-      </w:r>
-    </w:p>
-    <w:p>
-      <w:pPr>
-        <w:pStyle w:val="Compact"/>
-        <w:numPr>
-          <w:ilvl w:val="0"/>
-          <w:numId w:val="1014"/>
-        </w:numPr>
-      </w:pPr>
-      <w:r>
-        <w:t xml:space="preserve">Domain_Model.md</w:t>
-      </w:r>
-    </w:p>
-    <w:p>
-      <w:pPr>
-        <w:pStyle w:val="Compact"/>
-        <w:numPr>
-          <w:ilvl w:val="0"/>
-          <w:numId w:val="1014"/>
-        </w:numPr>
-      </w:pPr>
-      <w:r>
-        <w:t xml:space="preserve">AGENTS.md</w:t>
-      </w:r>
-    </w:p>
-    <w:bookmarkEnd w:id="25"/>
     <w:sectPr>
       <w:footnotePr>
         <w:numRestart w:val="eachSect"/>
@@ -1729,36 +877,6 @@
     <w:abstractNumId w:val="991"/>
   </w:num>
   <w:num w:numId="1004">
-    <w:abstractNumId w:val="991"/>
-  </w:num>
-  <w:num w:numId="1005">
-    <w:abstractNumId w:val="991"/>
-  </w:num>
-  <w:num w:numId="1006">
-    <w:abstractNumId w:val="991"/>
-  </w:num>
-  <w:num w:numId="1007">
-    <w:abstractNumId w:val="991"/>
-  </w:num>
-  <w:num w:numId="1008">
-    <w:abstractNumId w:val="991"/>
-  </w:num>
-  <w:num w:numId="1009">
-    <w:abstractNumId w:val="991"/>
-  </w:num>
-  <w:num w:numId="1010">
-    <w:abstractNumId w:val="991"/>
-  </w:num>
-  <w:num w:numId="1011">
-    <w:abstractNumId w:val="991"/>
-  </w:num>
-  <w:num w:numId="1012">
-    <w:abstractNumId w:val="991"/>
-  </w:num>
-  <w:num w:numId="1013">
-    <w:abstractNumId w:val="991"/>
-  </w:num>
-  <w:num w:numId="1014">
     <w:abstractNumId w:val="991"/>
   </w:num>
 </w:numbering>

</xml_diff>